<commit_message>
Master résumé is now the story-clusters version (his call: make it master)
The old master is kept as variant:master-2026-09-29 and a .docx copy.
promote_variant_to_master.sql refuses unless the backup holds the current
master word for word and the sections match. New master .docx 35/35.

Co-Authored-By: Claude Opus 5.5 <noreply@anthropic.com>
</commit_message>
<xml_diff>
--- a/master/Abhisheik_Deo_Resume.docx
+++ b/master/Abhisheik_Deo_Resume.docx
@@ -71,7 +71,7 @@
         <w:pStyle w:val="Subtitle"/>
       </w:pPr>
       <w:r>
-        <w:t>Hands-on Principal Architect · 19+ yrs · Java + Spring Boot (11 yrs) · Multi-tenant SaaS · AWS, Kubernetes, Terraform · Graph + GNN · LLM · HIPAA, ISO 27001 · AI-Leveraged Delivery (Claude Code + OpenAI Codex)</w:t>
+        <w:t>Hands-on Principal Architect · 19+ yrs · Problem-first production AI: RAG, multi-agent, LLM · Java + Spring Boot (11 yrs) · Multi-tenant SaaS · AWS (ECS Fargate), Terraform · Graph + GNN · HIPAA, ISO 27001 · AI-Leveraged Delivery (Claude Code + OpenAI Codex)</w:t>
       </w:r>
     </w:p>
     <w:p>
@@ -94,7 +94,7 @@
         <w:t>19+ years</w:t>
       </w:r>
       <w:r>
-        <w:t xml:space="preserve">, strongest in </w:t>
+        <w:t xml:space="preserve">, who starts from the business problem and designs back to the architecture. Strongest in </w:t>
       </w:r>
       <w:r>
         <w:rPr>
@@ -103,7 +103,7 @@
         <w:t>Java and Spring Boot</w:t>
       </w:r>
       <w:r>
-        <w:t xml:space="preserve"> — about </w:t>
+        <w:t xml:space="preserve">: about </w:t>
       </w:r>
       <w:r>
         <w:rPr>
@@ -121,7 +121,7 @@
         <w:t>Spring Boot 2.x on Java 8/17</w:t>
       </w:r>
       <w:r>
-        <w:t xml:space="preserve"> through February 2025. Consolidated per-customer deployments onto shared </w:t>
+        <w:t xml:space="preserve"> through February 2025. At Deque, every customer ran its own instance, so each upgrade and onboarding was repeated per customer; consolidated per-customer deployments onto shared </w:t>
       </w:r>
       <w:r>
         <w:rPr>
@@ -130,7 +130,7 @@
         <w:t>multi-tenant</w:t>
       </w:r>
       <w:r>
-        <w:t xml:space="preserve"> software as a service (SaaS) infrastructure, with dedicated isolation for regulated banking customers. Rewrote a chat platform's core service from </w:t>
+        <w:t xml:space="preserve"> software as a service (SaaS) infrastructure, with dedicated isolation for regulated banking customers. At VoltusWave, a chronic-care client needed artificial intelligence (AI) in its product to raise investment, which first needed patients on a reliable chat platform: rewrote its core chat service from </w:t>
       </w:r>
       <w:r>
         <w:rPr>
@@ -157,16 +157,7 @@
         <w:t>Health Insurance Portability and Accountability Act (HIPAA)</w:t>
       </w:r>
       <w:r>
-        <w:t xml:space="preserve"> certification. Built </w:t>
-      </w:r>
-      <w:r>
-        <w:rPr>
-          <w:b/>
-        </w:rPr>
-        <w:t>ten analytics and artificial intelligence (AI) services</w:t>
-      </w:r>
-      <w:r>
-        <w:t xml:space="preserve"> on Amazon Web Services (AWS) for chronic care: causal inference and leakage-safe machine learning over </w:t>
+        <w:t xml:space="preserve"> compliance. Then built ten analytics and AI services on Amazon Web Services (AWS), all in production: retrieval-augmented generation (RAG) precedent search for clinicians, a multi-agent orchestrator, causal inference and leakage-safe machine learning over </w:t>
       </w:r>
       <w:r>
         <w:rPr>
@@ -175,7 +166,16 @@
         <w:t>9–10 years of patient history</w:t>
       </w:r>
       <w:r>
-        <w:t xml:space="preserve">, a </w:t>
+        <w:t xml:space="preserve">, and self-hosted </w:t>
+      </w:r>
+      <w:r>
+        <w:rPr>
+          <w:b/>
+        </w:rPr>
+        <w:t>large language models (LLMs)</w:t>
+      </w:r>
+      <w:r>
+        <w:t xml:space="preserve"> inside the client boundary, where code computes every number and a model only narrates; alongside them, a </w:t>
       </w:r>
       <w:r>
         <w:rPr>
@@ -184,22 +184,13 @@
         <w:t>graph neural network (GNN)</w:t>
       </w:r>
       <w:r>
-        <w:t xml:space="preserve"> context graph, and self-hosted </w:t>
+        <w:t xml:space="preserve"> context graph. Standardised the organisation on </w:t>
       </w:r>
       <w:r>
         <w:rPr>
           <w:b/>
         </w:rPr>
-        <w:t>large language models (LLMs)</w:t>
-      </w:r>
-      <w:r>
-        <w:t xml:space="preserve"> inside the client boundary. Standardised the organisation on </w:t>
-      </w:r>
-      <w:r>
-        <w:rPr>
-          <w:b/>
-        </w:rPr>
-        <w:t>Kubernetes and Terraform</w:t>
+        <w:t>Terraform and Amazon Elastic Container Service (ECS) Fargate</w:t>
       </w:r>
       <w:r>
         <w:t xml:space="preserve">, cutting infrastructure cost </w:t>
@@ -261,7 +252,7 @@
         <w:t>Decision-Intelligence Platforms</w:t>
       </w:r>
       <w:r>
-        <w:t xml:space="preserve"> (Event-Sourced + Graph + AI)</w:t>
+        <w:t xml:space="preserve"> (Event-Sourced + Graph + AI; Retrieval, Cohort Aggregation, Sequence Mining and Graph Traversal archetypes)</w:t>
       </w:r>
     </w:p>
     <w:p>
@@ -317,7 +308,7 @@
         <w:t>Multi-Tenant SaaS Architecture</w:t>
       </w:r>
       <w:r>
-        <w:t xml:space="preserve"> (Shared-Schema, Per-Tenant Isolation, Regulated Carve-Outs)</w:t>
+        <w:t xml:space="preserve"> (Shared-Schema, Per-Tenant Isolation, Regulated Carve-Outs, Shared or Dedicated Amazon Neptune per Tenant)</w:t>
       </w:r>
     </w:p>
     <w:p>
@@ -370,10 +361,10 @@
         <w:rPr>
           <w:b/>
         </w:rPr>
-        <w:t>Kubernetes, Terraform + Docker on AWS</w:t>
-      </w:r>
-      <w:r>
-        <w:t xml:space="preserve"> (company-wide standard, Elastic Container Service Fargate)</w:t>
+        <w:t>Terraform + Docker on AWS</w:t>
+      </w:r>
+      <w:r>
+        <w:t xml:space="preserve"> (company-wide standard, Elastic Container Service (ECS) Fargate)</w:t>
       </w:r>
     </w:p>
     <w:p>
@@ -429,7 +420,7 @@
         <w:t>Retrieval-Augmented Generation &amp; Vector Search</w:t>
       </w:r>
       <w:r>
-        <w:t xml:space="preserve"> (Elasticsearch dense_vector, Amazon SageMaker Embeddings)</w:t>
+        <w:t xml:space="preserve"> (Elasticsearch dense_vector, Amazon SageMaker Embeddings, warm-path P99 target under 200 ms)</w:t>
       </w:r>
     </w:p>
     <w:p>
@@ -693,6 +684,312 @@
         <w:pStyle w:val="ListBullet"/>
       </w:pPr>
       <w:r>
+        <w:t xml:space="preserve">Distilled the client's goal of raising investment on artificial intelligence (AI) into </w:t>
+      </w:r>
+      <w:r>
+        <w:rPr>
+          <w:b/>
+        </w:rPr>
+        <w:t>10 killer queries</w:t>
+      </w:r>
+      <w:r>
+        <w:t>, agreed with its chief executive, proving the AI was real</w:t>
+      </w:r>
+    </w:p>
+    <w:p>
+      <w:pPr>
+        <w:pStyle w:val="ListBullet"/>
+      </w:pPr>
+      <w:r>
+        <w:t xml:space="preserve">Pioneered a </w:t>
+      </w:r>
+      <w:r>
+        <w:rPr>
+          <w:b/>
+        </w:rPr>
+        <w:t>Context Graph on Amazon Neptune</w:t>
+      </w:r>
+      <w:r>
+        <w:t xml:space="preserve"> with graph neural network (GNN) models across 80+ chronic conditions, projected from an event-sourced DynamoDB single-table spine</w:t>
+      </w:r>
+    </w:p>
+    <w:p>
+      <w:pPr>
+        <w:pStyle w:val="ListBullet"/>
+      </w:pPr>
+      <w:r>
+        <w:t xml:space="preserve">Delivered </w:t>
+      </w:r>
+      <w:r>
+        <w:rPr>
+          <w:b/>
+        </w:rPr>
+        <w:t>10 decision-intelligence services</w:t>
+      </w:r>
+      <w:r>
+        <w:t xml:space="preserve"> on 4 query archetypes to production for ~10,000 patients, absorbing 20 review findings into one design</w:t>
+      </w:r>
+    </w:p>
+    <w:p>
+      <w:pPr>
+        <w:pStyle w:val="ListBullet"/>
+      </w:pPr>
+      <w:r>
+        <w:t xml:space="preserve">Engineered retrieval-augmented generation (RAG) for clinical precedent search across </w:t>
+      </w:r>
+      <w:r>
+        <w:rPr>
+          <w:b/>
+        </w:rPr>
+        <w:t>80+ chronic conditions</w:t>
+      </w:r>
+      <w:r>
+        <w:t>, because a database filter returns a cohort, not the most analogous decisions</w:t>
+      </w:r>
+    </w:p>
+    <w:p>
+      <w:pPr>
+        <w:pStyle w:val="ListBullet"/>
+      </w:pPr>
+      <w:r>
+        <w:t xml:space="preserve">Optimised retrieval around the decision, not the patient, via tenant-filtered </w:t>
+      </w:r>
+      <w:r>
+        <w:rPr>
+          <w:b/>
+        </w:rPr>
+        <w:t>Elasticsearch dense_vector</w:t>
+      </w:r>
+      <w:r>
+        <w:t xml:space="preserve"> nearest-neighbour search, tuned to a 0.75 normalised discounted cumulative gain target</w:t>
+      </w:r>
+    </w:p>
+    <w:p>
+      <w:pPr>
+        <w:pStyle w:val="ListBullet"/>
+      </w:pPr>
+      <w:r>
+        <w:t xml:space="preserve">Launched the precedent panel </w:t>
+      </w:r>
+      <w:r>
+        <w:rPr>
+          <w:b/>
+        </w:rPr>
+        <w:t>in production</w:t>
+      </w:r>
+      <w:r>
+        <w:t xml:space="preserve"> for doctors, health coaches and guidance counsellors, answering cases short of 7 required fields with a plain cohort count</w:t>
+      </w:r>
+    </w:p>
+    <w:p>
+      <w:pPr>
+        <w:pStyle w:val="ListBullet"/>
+      </w:pPr>
+      <w:r>
+        <w:t xml:space="preserve">Conceived a </w:t>
+      </w:r>
+      <w:r>
+        <w:rPr>
+          <w:b/>
+        </w:rPr>
+        <w:t>multi-agent orchestrator</w:t>
+      </w:r>
+      <w:r>
+        <w:t xml:space="preserve"> showing which care decisions followed when a patient's payments, adherence and support broke inside one 90-day window</w:t>
+      </w:r>
+    </w:p>
+    <w:p>
+      <w:pPr>
+        <w:pStyle w:val="ListBullet"/>
+      </w:pPr>
+      <w:r>
+        <w:t xml:space="preserve">Developed orchestration as a deterministic LangGraph state graph: </w:t>
+      </w:r>
+      <w:r>
+        <w:rPr>
+          <w:b/>
+        </w:rPr>
+        <w:t>3 blind finder agents</w:t>
+      </w:r>
+      <w:r>
+        <w:t xml:space="preserve"> run in parallel; a barrier re-verifies every proposed patient against a frozen snapshot</w:t>
+      </w:r>
+    </w:p>
+    <w:p>
+      <w:pPr>
+        <w:pStyle w:val="ListBullet"/>
+      </w:pPr>
+      <w:r>
+        <w:t xml:space="preserve">Shipped the orchestrator to production behind </w:t>
+      </w:r>
+      <w:r>
+        <w:rPr>
+          <w:b/>
+        </w:rPr>
+        <w:t>executive and operations dashboards</w:t>
+      </w:r>
+      <w:r>
+        <w:t xml:space="preserve"> and audited per-patient drill-ins, suppressing any delta failing a 0.10 balance gate</w:t>
+      </w:r>
+    </w:p>
+    <w:p>
+      <w:pPr>
+        <w:pStyle w:val="ListBullet"/>
+      </w:pPr>
+      <w:r>
+        <w:t xml:space="preserve">Secured protected health information inside the client virtual private cloud, self-hosting </w:t>
+      </w:r>
+      <w:r>
+        <w:rPr>
+          <w:b/>
+        </w:rPr>
+        <w:t>Llama 3.1</w:t>
+      </w:r>
+      <w:r>
+        <w:t xml:space="preserve"> on Ollama, embeddings and LangSmith tracing so patient data never left</w:t>
+      </w:r>
+    </w:p>
+    <w:p>
+      <w:pPr>
+        <w:pStyle w:val="ListBullet"/>
+      </w:pPr>
+      <w:r>
+        <w:t xml:space="preserve">Restricted large language models (LLMs) in production to narrating code-computed numbers — pinned model, </w:t>
+      </w:r>
+      <w:r>
+        <w:rPr>
+          <w:b/>
+        </w:rPr>
+        <w:t>temperature 0</w:t>
+      </w:r>
+      <w:r>
+        <w:t>, chain hash, field-level claim grammar rejecting uncited claims</w:t>
+      </w:r>
+    </w:p>
+    <w:p>
+      <w:pPr>
+        <w:pStyle w:val="ListBullet"/>
+      </w:pPr>
+      <w:r>
+        <w:t xml:space="preserve">Instituted confounder-gated cohort comparisons, since clinicians override on their sickest patients, making any headline failing a </w:t>
+      </w:r>
+      <w:r>
+        <w:rPr>
+          <w:b/>
+        </w:rPr>
+        <w:t>0.1 standardised mean difference</w:t>
+      </w:r>
+      <w:r>
+        <w:t xml:space="preserve"> balance check unrepresentable</w:t>
+      </w:r>
+    </w:p>
+    <w:p>
+      <w:pPr>
+        <w:pStyle w:val="ListBullet"/>
+      </w:pPr>
+      <w:r>
+        <w:t xml:space="preserve">Strengthened statistical rigour across </w:t>
+      </w:r>
+      <w:r>
+        <w:rPr>
+          <w:b/>
+        </w:rPr>
+        <w:t>6 production pipelines</w:t>
+      </w:r>
+      <w:r>
+        <w:t xml:space="preserve"> with propensity matching, B=2000 bootstrap resamples and a Rosenbaum γ plus E-value sensitivity battery, feeding governed dashboards</w:t>
+      </w:r>
+    </w:p>
+    <w:p>
+      <w:pPr>
+        <w:pStyle w:val="ListBullet"/>
+      </w:pPr>
+      <w:r>
+        <w:t xml:space="preserve">Transformed patient event histories into a relapse early-warning model on </w:t>
+      </w:r>
+      <w:r>
+        <w:rPr>
+          <w:b/>
+        </w:rPr>
+        <w:t>Amazon SageMaker</w:t>
+      </w:r>
+      <w:r>
+        <w:t>, since relapse, at a 5–15% base rate, shows in event order, not counts</w:t>
+      </w:r>
+    </w:p>
+    <w:p>
+      <w:pPr>
+        <w:pStyle w:val="ListBullet"/>
+      </w:pPr>
+      <w:r>
+        <w:t xml:space="preserve">Gated the model on </w:t>
+      </w:r>
+      <w:r>
+        <w:rPr>
+          <w:b/>
+        </w:rPr>
+        <w:t>6-month</w:t>
+      </w:r>
+      <w:r>
+        <w:t xml:space="preserve"> matured outcome labels, then rolled it out to health coaches under per-coach daily alert budgets and an owned alert lifecycle</w:t>
+      </w:r>
+    </w:p>
+    <w:p>
+      <w:pPr>
+        <w:pStyle w:val="ListBullet"/>
+      </w:pPr>
+      <w:r>
+        <w:t xml:space="preserve">Enforced multi-tenant isolation under a Health Insurance Portability and Accountability Act (HIPAA) framework across </w:t>
+      </w:r>
+      <w:r>
+        <w:rPr>
+          <w:b/>
+        </w:rPr>
+        <w:t>10 production pipelines</w:t>
+      </w:r>
+      <w:r>
+        <w:t xml:space="preserve"> — tenant-scoped traversal-source wrapper, Parquet partitioning, runtime assertions</w:t>
+      </w:r>
+    </w:p>
+    <w:p>
+      <w:pPr>
+        <w:pStyle w:val="ListBullet"/>
+      </w:pPr>
+      <w:r>
+        <w:t xml:space="preserve">Deployed Datadog observability since nobody knew why the chat platform was unreliable, cutting errors to </w:t>
+      </w:r>
+      <w:r>
+        <w:rPr>
+          <w:b/>
+        </w:rPr>
+        <w:t>under 3%</w:t>
+      </w:r>
+      <w:r>
+        <w:t xml:space="preserve"> and revealing ~50 downstream calls per patient message</w:t>
+      </w:r>
+    </w:p>
+    <w:p>
+      <w:pPr>
+        <w:pStyle w:val="ListBullet"/>
+      </w:pPr>
+      <w:r>
+        <w:t xml:space="preserve">Spearheaded the chat service rewrite from Node.js to Go, reaching </w:t>
+      </w:r>
+      <w:r>
+        <w:rPr>
+          <w:b/>
+        </w:rPr>
+        <w:t>100,000 concurrent connections</w:t>
+      </w:r>
+      <w:r>
+        <w:t xml:space="preserve"> at P95 under 16 ms in k6-validated burst testing</w:t>
+      </w:r>
+    </w:p>
+    <w:p>
+      <w:pPr>
+        <w:pStyle w:val="ListBullet"/>
+      </w:pPr>
+      <w:r>
         <w:t xml:space="preserve">Architected a two-stream </w:t>
       </w:r>
       <w:r>
@@ -702,16 +999,16 @@
         <w:t>Amazon Kinesis</w:t>
       </w:r>
       <w:r>
-        <w:t xml:space="preserve"> design with Enhanced Fan-Out, expanding </w:t>
+        <w:t xml:space="preserve"> design with Enhanced Fan-Out in on-demand mode, scaling from 4 to </w:t>
       </w:r>
       <w:r>
         <w:rPr>
           <w:b/>
         </w:rPr>
-        <w:t>4 to 1,200 shards</w:t>
-      </w:r>
-      <w:r>
-        <w:t xml:space="preserve"> to absorb traffic spikes on a chat platform</w:t>
+        <w:t>~1,200 shards</w:t>
+      </w:r>
+      <w:r>
+        <w:t xml:space="preserve"> under load testing</w:t>
       </w:r>
     </w:p>
     <w:p>
@@ -719,34 +1016,16 @@
         <w:pStyle w:val="ListBullet"/>
       </w:pPr>
       <w:r>
-        <w:t xml:space="preserve">Spearheaded the complete rewrite of the core chat service from </w:t>
+        <w:t xml:space="preserve">Reimagined the data layer across DynamoDB, PostgreSQL and OpenSearch with partition-key and indexing design holding DynamoDB writes under </w:t>
       </w:r>
       <w:r>
         <w:rPr>
           <w:b/>
         </w:rPr>
-        <w:t>Node.js</w:t>
-      </w:r>
-      <w:r>
-        <w:t xml:space="preserve"> to </w:t>
-      </w:r>
-      <w:r>
-        <w:rPr>
-          <w:b/>
-        </w:rPr>
-        <w:t>Go</w:t>
-      </w:r>
-      <w:r>
-        <w:t xml:space="preserve"> for </w:t>
-      </w:r>
-      <w:r>
-        <w:rPr>
-          <w:b/>
-        </w:rPr>
-        <w:t>100,000-connection</w:t>
-      </w:r>
-      <w:r>
-        <w:t xml:space="preserve"> concurrency</w:t>
+        <w:t>16 ms P95</w:t>
+      </w:r>
+      <w:r>
+        <w:t xml:space="preserve"> at 100,000-user load</w:t>
       </w:r>
     </w:p>
     <w:p>
@@ -754,112 +1033,7 @@
         <w:pStyle w:val="ListBullet"/>
       </w:pPr>
       <w:r>
-        <w:t xml:space="preserve">Scaled a </w:t>
-      </w:r>
-      <w:r>
-        <w:rPr>
-          <w:b/>
-        </w:rPr>
-        <w:t>Go</w:t>
-      </w:r>
-      <w:r>
-        <w:t xml:space="preserve"> chat service to </w:t>
-      </w:r>
-      <w:r>
-        <w:rPr>
-          <w:b/>
-        </w:rPr>
-        <w:t>100,000 concurrent connections</w:t>
-      </w:r>
-      <w:r>
-        <w:t xml:space="preserve"> at </w:t>
-      </w:r>
-      <w:r>
-        <w:rPr>
-          <w:b/>
-        </w:rPr>
-        <w:t>P95 under 16 ms</w:t>
-      </w:r>
-      <w:r>
-        <w:t xml:space="preserve"> in k6-validated burst testing, on ~50 calls per message</w:t>
-      </w:r>
-    </w:p>
-    <w:p>
-      <w:pPr>
-        <w:pStyle w:val="ListBullet"/>
-      </w:pPr>
-      <w:r>
-        <w:t xml:space="preserve">Reimagined the data layer across </w:t>
-      </w:r>
-      <w:r>
-        <w:rPr>
-          <w:b/>
-        </w:rPr>
-        <w:t>DynamoDB</w:t>
-      </w:r>
-      <w:r>
-        <w:t xml:space="preserve">, </w:t>
-      </w:r>
-      <w:r>
-        <w:rPr>
-          <w:b/>
-        </w:rPr>
-        <w:t>PostgreSQL</w:t>
-      </w:r>
-      <w:r>
-        <w:t xml:space="preserve"> and </w:t>
-      </w:r>
-      <w:r>
-        <w:rPr>
-          <w:b/>
-        </w:rPr>
-        <w:t>OpenSearch</w:t>
-      </w:r>
-      <w:r>
-        <w:t xml:space="preserve"> with partition-key and indexing design holding </w:t>
-      </w:r>
-      <w:r>
-        <w:rPr>
-          <w:b/>
-        </w:rPr>
-        <w:t>P95 under 30 ms</w:t>
-      </w:r>
-      <w:r>
-        <w:t xml:space="preserve"> at 100,000-user load</w:t>
-      </w:r>
-    </w:p>
-    <w:p>
-      <w:pPr>
-        <w:pStyle w:val="ListBullet"/>
-      </w:pPr>
-      <w:r>
-        <w:t xml:space="preserve">Deployed </w:t>
-      </w:r>
-      <w:r>
-        <w:rPr>
-          <w:b/>
-        </w:rPr>
-        <w:t>Datadog</w:t>
-      </w:r>
-      <w:r>
-        <w:t xml:space="preserve"> observability across production services, cutting the error rate to </w:t>
-      </w:r>
-      <w:r>
-        <w:rPr>
-          <w:b/>
-        </w:rPr>
-        <w:t>under 3%</w:t>
-      </w:r>
-      <w:r>
-        <w:t xml:space="preserve"> and making reliability measurable for the first time</w:t>
-      </w:r>
-    </w:p>
-    <w:p>
-      <w:pPr>
-        <w:pStyle w:val="ListBullet"/>
-      </w:pPr>
-      <w:r>
-        <w:t xml:space="preserve">Delivered patient onboarding off a third-party messaging tool onto the in-house platform, moving </w:t>
+        <w:t xml:space="preserve">Published React Native apps to 2 app stores with Firebase Cloud Messaging and Apple Push Notification service (APNs), moving </w:t>
       </w:r>
       <w:r>
         <w:rPr>
@@ -868,387 +1042,7 @@
         <w:t>10,000+ patients</w:t>
       </w:r>
       <w:r>
-        <w:t xml:space="preserve"> onto the product as primary channel</w:t>
-      </w:r>
-    </w:p>
-    <w:p>
-      <w:pPr>
-        <w:pStyle w:val="ListBullet"/>
-      </w:pPr>
-      <w:r>
-        <w:t xml:space="preserve">Engineered a retrieval-augmented generation (RAG) pipeline on </w:t>
-      </w:r>
-      <w:r>
-        <w:rPr>
-          <w:b/>
-        </w:rPr>
-        <w:t>Elasticsearch dense_vector</w:t>
-      </w:r>
-      <w:r>
-        <w:t xml:space="preserve"> filtered nearest-neighbour search across </w:t>
-      </w:r>
-      <w:r>
-        <w:rPr>
-          <w:b/>
-        </w:rPr>
-        <w:t>80+ chronic conditions</w:t>
-      </w:r>
-      <w:r>
-        <w:t xml:space="preserve">, keeping </w:t>
-      </w:r>
-      <w:r>
-        <w:rPr>
-          <w:b/>
-        </w:rPr>
-        <w:t>Amazon Neptune</w:t>
-      </w:r>
-      <w:r>
-        <w:t xml:space="preserve"> off the serving path</w:t>
-      </w:r>
-    </w:p>
-    <w:p>
-      <w:pPr>
-        <w:pStyle w:val="ListBullet"/>
-      </w:pPr>
-      <w:r>
-        <w:t xml:space="preserve">Tuned precedent retrieval on </w:t>
-      </w:r>
-      <w:r>
-        <w:rPr>
-          <w:b/>
-        </w:rPr>
-        <w:t>Elasticsearch dense_vector</w:t>
-      </w:r>
-      <w:r>
-        <w:t xml:space="preserve"> search with self-hosted </w:t>
-      </w:r>
-      <w:r>
-        <w:rPr>
-          <w:b/>
-        </w:rPr>
-        <w:t>Amazon SageMaker</w:t>
-      </w:r>
-      <w:r>
-        <w:t xml:space="preserve"> embedders, designed against warm-path </w:t>
-      </w:r>
-      <w:r>
-        <w:rPr>
-          <w:b/>
-        </w:rPr>
-        <w:t>P99 under 200 ms</w:t>
-      </w:r>
-      <w:r>
-        <w:t xml:space="preserve"> and </w:t>
-      </w:r>
-      <w:r>
-        <w:rPr>
-          <w:b/>
-        </w:rPr>
-        <w:t>0.75 normalised discounted cumulative gain</w:t>
-      </w:r>
-    </w:p>
-    <w:p>
-      <w:pPr>
-        <w:pStyle w:val="ListBullet"/>
-      </w:pPr>
-      <w:r>
-        <w:t xml:space="preserve">Pioneered a Context Graph on </w:t>
-      </w:r>
-      <w:r>
-        <w:rPr>
-          <w:b/>
-        </w:rPr>
-        <w:t>Amazon Neptune</w:t>
-      </w:r>
-      <w:r>
-        <w:t xml:space="preserve"> with </w:t>
-      </w:r>
-      <w:r>
-        <w:rPr>
-          <w:b/>
-        </w:rPr>
-        <w:t>graph neural network (GNN)</w:t>
-      </w:r>
-      <w:r>
-        <w:t xml:space="preserve"> models, powering virtual-care decision intelligence across </w:t>
-      </w:r>
-      <w:r>
-        <w:rPr>
-          <w:b/>
-        </w:rPr>
-        <w:t>80+ chronic conditions</w:t>
-      </w:r>
-    </w:p>
-    <w:p>
-      <w:pPr>
-        <w:pStyle w:val="ListBullet"/>
-      </w:pPr>
-      <w:r>
-        <w:t xml:space="preserve">Assembled a </w:t>
-      </w:r>
-      <w:r>
-        <w:rPr>
-          <w:b/>
-        </w:rPr>
-        <w:t>10-query</w:t>
-      </w:r>
-      <w:r>
-        <w:t xml:space="preserve"> decision-intelligence platform on </w:t>
-      </w:r>
-      <w:r>
-        <w:rPr>
-          <w:b/>
-        </w:rPr>
-        <w:t>4 reusable archetypes</w:t>
-      </w:r>
-      <w:r>
-        <w:t xml:space="preserve"> — Retrieval, Cohort Aggregation, Sequence Mining, Graph Traversal — on </w:t>
-      </w:r>
-      <w:r>
-        <w:rPr>
-          <w:b/>
-        </w:rPr>
-        <w:t>Amazon Neptune</w:t>
-      </w:r>
-    </w:p>
-    <w:p>
-      <w:pPr>
-        <w:pStyle w:val="ListBullet"/>
-      </w:pPr>
-      <w:r>
-        <w:t xml:space="preserve">Instituted event sourcing on </w:t>
-      </w:r>
-      <w:r>
-        <w:rPr>
-          <w:b/>
-        </w:rPr>
-        <w:t>DynamoDB single-table</w:t>
-      </w:r>
-      <w:r>
-        <w:t xml:space="preserve"> design with a deterministic </w:t>
-      </w:r>
-      <w:r>
-        <w:rPr>
-          <w:b/>
-        </w:rPr>
-        <w:t>Parquet</w:t>
-      </w:r>
-      <w:r>
-        <w:t xml:space="preserve"> snapshot exporter and correction-event backbone, targeting </w:t>
-      </w:r>
-      <w:r>
-        <w:rPr>
-          <w:b/>
-        </w:rPr>
-        <w:t>P95 under 5 minutes</w:t>
-      </w:r>
-      <w:r>
-        <w:t xml:space="preserve"> for dependency-targeted slice rebuilds</w:t>
-      </w:r>
-    </w:p>
-    <w:p>
-      <w:pPr>
-        <w:pStyle w:val="ListBullet"/>
-      </w:pPr>
-      <w:r>
-        <w:t xml:space="preserve">Sealed multi-tenant isolation across </w:t>
-      </w:r>
-      <w:r>
-        <w:rPr>
-          <w:b/>
-        </w:rPr>
-        <w:t>10 production pipelines</w:t>
-      </w:r>
-      <w:r>
-        <w:t xml:space="preserve"> — a </w:t>
-      </w:r>
-      <w:r>
-        <w:rPr>
-          <w:b/>
-        </w:rPr>
-        <w:t>tenant-scoped traversal-source</w:t>
-      </w:r>
-      <w:r>
-        <w:t xml:space="preserve"> wrapper, Parquet partitioning, runtime assertions and per-tenant </w:t>
-      </w:r>
-      <w:r>
-        <w:rPr>
-          <w:b/>
-        </w:rPr>
-        <w:t>Amazon Neptune</w:t>
-      </w:r>
-      <w:r>
-        <w:t xml:space="preserve"> for the healthcare-data tier</w:t>
-      </w:r>
-    </w:p>
-    <w:p>
-      <w:pPr>
-        <w:pStyle w:val="ListBullet"/>
-      </w:pPr>
-      <w:r>
-        <w:t xml:space="preserve">Secured protected health information inside the client </w:t>
-      </w:r>
-      <w:r>
-        <w:rPr>
-          <w:b/>
-        </w:rPr>
-        <w:t>virtual private cloud</w:t>
-      </w:r>
-      <w:r>
-        <w:t xml:space="preserve"> by self-hosting embeddings and </w:t>
-      </w:r>
-      <w:r>
-        <w:rPr>
-          <w:b/>
-        </w:rPr>
-        <w:t>Llama 3.1</w:t>
-      </w:r>
-      <w:r>
-        <w:t xml:space="preserve"> for every model call</w:t>
-      </w:r>
-    </w:p>
-    <w:p>
-      <w:pPr>
-        <w:pStyle w:val="ListBullet"/>
-      </w:pPr>
-      <w:r>
-        <w:t xml:space="preserve">Enforced </w:t>
-      </w:r>
-      <w:r>
-        <w:rPr>
-          <w:b/>
-        </w:rPr>
-        <w:t>large language model (LLM)</w:t>
-      </w:r>
-      <w:r>
-        <w:t xml:space="preserve"> narrative guardrails — pinned model, temperature 0, chain hash, field-level claim grammar — designed to reject </w:t>
-      </w:r>
-      <w:r>
-        <w:rPr>
-          <w:b/>
-        </w:rPr>
-        <w:t>100% of uncited claims</w:t>
-      </w:r>
-    </w:p>
-    <w:p>
-      <w:pPr>
-        <w:pStyle w:val="ListBullet"/>
-      </w:pPr>
-      <w:r>
-        <w:t xml:space="preserve">Formalised a </w:t>
-      </w:r>
-      <w:r>
-        <w:rPr>
-          <w:b/>
-        </w:rPr>
-        <w:t>Health Insurance Portability and Accountability Act (HIPAA)</w:t>
-      </w:r>
-      <w:r>
-        <w:t xml:space="preserve"> control framework across </w:t>
-      </w:r>
-      <w:r>
-        <w:rPr>
-          <w:b/>
-        </w:rPr>
-        <w:t>10 production pipelines</w:t>
-      </w:r>
-      <w:r>
-        <w:t xml:space="preserve"> — data protection, access governance, audit trails for clinical workflows</w:t>
-      </w:r>
-    </w:p>
-    <w:p>
-      <w:pPr>
-        <w:pStyle w:val="ListBullet"/>
-      </w:pPr>
-      <w:r>
-        <w:t xml:space="preserve">Hardened ten production analytics services through structured adversarial self-review, absorbing </w:t>
-      </w:r>
-      <w:r>
-        <w:rPr>
-          <w:b/>
-        </w:rPr>
-        <w:t>twenty findings</w:t>
-      </w:r>
-      <w:r>
-        <w:t xml:space="preserve"> into one design and holding another dark until its upstream contract shipped</w:t>
-      </w:r>
-    </w:p>
-    <w:p>
-      <w:pPr>
-        <w:pStyle w:val="ListBullet"/>
-      </w:pPr>
-      <w:r>
-        <w:t xml:space="preserve">Extracted confounder-gated cohort comparisons behind propensity matching and </w:t>
-      </w:r>
-      <w:r>
-        <w:rPr>
-          <w:b/>
-        </w:rPr>
-        <w:t>standardised mean difference</w:t>
-      </w:r>
-      <w:r>
-        <w:t xml:space="preserve"> balance checks, making an unbalanced headline unrepresentable in the output type</w:t>
-      </w:r>
-    </w:p>
-    <w:p>
-      <w:pPr>
-        <w:pStyle w:val="ListBullet"/>
-      </w:pPr>
-      <w:r>
-        <w:t xml:space="preserve">Strengthened statistical rigour across </w:t>
-      </w:r>
-      <w:r>
-        <w:rPr>
-          <w:b/>
-        </w:rPr>
-        <w:t>6 production pipelines</w:t>
-      </w:r>
-      <w:r>
-        <w:t xml:space="preserve"> with </w:t>
-      </w:r>
-      <w:r>
-        <w:rPr>
-          <w:b/>
-        </w:rPr>
-        <w:t>B=2000 bootstrap resamples</w:t>
-      </w:r>
-      <w:r>
-        <w:t xml:space="preserve"> and a </w:t>
-      </w:r>
-      <w:r>
-        <w:rPr>
-          <w:b/>
-        </w:rPr>
-        <w:t>Rosenbaum γ plus E-value</w:t>
-      </w:r>
-      <w:r>
-        <w:t xml:space="preserve"> sensitivity battery, keyed by shared match_manifest_id</w:t>
-      </w:r>
-    </w:p>
-    <w:p>
-      <w:pPr>
-        <w:pStyle w:val="ListBullet"/>
-      </w:pPr>
-      <w:r>
-        <w:t xml:space="preserve">Distilled patient event histories into a relapse early-warning model on </w:t>
-      </w:r>
-      <w:r>
-        <w:rPr>
-          <w:b/>
-        </w:rPr>
-        <w:t>Amazon SageMaker</w:t>
-      </w:r>
-      <w:r>
-        <w:t xml:space="preserve">, gated by a </w:t>
-      </w:r>
-      <w:r>
-        <w:rPr>
-          <w:b/>
-        </w:rPr>
-        <w:t>6-month</w:t>
-      </w:r>
-      <w:r>
-        <w:t xml:space="preserve"> maturity window never to train on immature outcome labels</w:t>
+        <w:t xml:space="preserve"> off third-party messaging</w:t>
       </w:r>
     </w:p>
     <w:p>
@@ -1265,13 +1059,24 @@
         <w:t>0 to 20+</w:t>
       </w:r>
       <w:r>
-        <w:t xml:space="preserve"> across backend, React Native, web, artificial intelligence, quality assurance (QA) and DevOps in </w:t>
+        <w:t xml:space="preserve"> across 6 sub-teams — backend, React Native, web, artificial intelligence, quality assurance (QA), DevOps — standardised on Go and DynamoDB</w:t>
+      </w:r>
+    </w:p>
+    <w:p>
+      <w:pPr>
+        <w:pStyle w:val="ListBullet"/>
+      </w:pPr>
+      <w:r>
+        <w:t xml:space="preserve">Drove a Claude Code and OpenAI Codex rollout across a </w:t>
       </w:r>
       <w:r>
         <w:rPr>
           <w:b/>
         </w:rPr>
-        <w:t>6 sub-teams</w:t>
+        <w:t>20-engineer team</w:t>
+      </w:r>
+      <w:r>
+        <w:t>, codifying repository standards in CLAUDE.md and AGENTS.md files to shorten onboarding</w:t>
       </w:r>
     </w:p>
     <w:p>
@@ -1279,119 +1084,13 @@
         <w:pStyle w:val="ListBullet"/>
       </w:pPr>
       <w:r>
-        <w:t xml:space="preserve">Brokered company-wide adoption of </w:t>
+        <w:t xml:space="preserve">Provisioned Amazon Web Services on Terraform and Elastic Container Service Fargate at </w:t>
       </w:r>
       <w:r>
         <w:rPr>
           <w:b/>
         </w:rPr>
-        <w:t>Go</w:t>
-      </w:r>
-      <w:r>
-        <w:t xml:space="preserve"> and </w:t>
-      </w:r>
-      <w:r>
-        <w:rPr>
-          <w:b/>
-        </w:rPr>
-        <w:t>DynamoDB</w:t>
-      </w:r>
-      <w:r>
-        <w:t xml:space="preserve"> across </w:t>
-      </w:r>
-      <w:r>
-        <w:rPr>
-          <w:b/>
-        </w:rPr>
-        <w:t>5 sub-teams</w:t>
-      </w:r>
-      <w:r>
-        <w:t>, setting cross-organisational technical strategy backed by design-doc discipline</w:t>
-      </w:r>
-    </w:p>
-    <w:p>
-      <w:pPr>
-        <w:pStyle w:val="ListBullet"/>
-      </w:pPr>
-      <w:r>
-        <w:t xml:space="preserve">Published </w:t>
-      </w:r>
-      <w:r>
-        <w:rPr>
-          <w:b/>
-        </w:rPr>
-        <w:t>React Native</w:t>
-      </w:r>
-      <w:r>
-        <w:t xml:space="preserve"> applications across </w:t>
-      </w:r>
-      <w:r>
-        <w:rPr>
-          <w:b/>
-        </w:rPr>
-        <w:t>2 app stores</w:t>
-      </w:r>
-      <w:r>
-        <w:t xml:space="preserve"> end to end, wiring </w:t>
-      </w:r>
-      <w:r>
-        <w:rPr>
-          <w:b/>
-        </w:rPr>
-        <w:t>Firebase Cloud Messaging</w:t>
-      </w:r>
-      <w:r>
-        <w:t xml:space="preserve"> and </w:t>
-      </w:r>
-      <w:r>
-        <w:rPr>
-          <w:b/>
-        </w:rPr>
-        <w:t>Apple Push Notification service (APNs)</w:t>
-      </w:r>
-      <w:r>
-        <w:t xml:space="preserve"> for push messaging</w:t>
-      </w:r>
-    </w:p>
-    <w:p>
-      <w:pPr>
-        <w:pStyle w:val="ListBullet"/>
-      </w:pPr>
-      <w:r>
-        <w:t xml:space="preserve">Provisioned </w:t>
-      </w:r>
-      <w:r>
-        <w:rPr>
-          <w:b/>
-        </w:rPr>
-        <w:t>Amazon Web Services</w:t>
-      </w:r>
-      <w:r>
-        <w:t xml:space="preserve"> on </w:t>
-      </w:r>
-      <w:r>
-        <w:rPr>
-          <w:b/>
-        </w:rPr>
-        <w:t>Kubernetes</w:t>
-      </w:r>
-      <w:r>
-        <w:t xml:space="preserve">, </w:t>
-      </w:r>
-      <w:r>
-        <w:rPr>
-          <w:b/>
-        </w:rPr>
-        <w:t>Terraform</w:t>
-      </w:r>
-      <w:r>
-        <w:t xml:space="preserve"> and </w:t>
-      </w:r>
-      <w:r>
-        <w:rPr>
-          <w:b/>
-        </w:rPr>
-        <w:t>Elastic Container Service Fargate at 70% Spot</w:t>
+        <w:t>70% Spot</w:t>
       </w:r>
       <w:r>
         <w:t xml:space="preserve"> — deploys </w:t>
@@ -1403,39 +1102,7 @@
         <w:t>under 10 minutes</w:t>
       </w:r>
       <w:r>
-        <w:t xml:space="preserve">, infrastructure cost down </w:t>
-      </w:r>
-      <w:r>
-        <w:rPr>
-          <w:b/>
-        </w:rPr>
-        <w:t>25–30%</w:t>
-      </w:r>
-    </w:p>
-    <w:p>
-      <w:pPr>
-        <w:pStyle w:val="ListBullet"/>
-      </w:pPr>
-      <w:r>
-        <w:t xml:space="preserve">Drove a measured </w:t>
-      </w:r>
-      <w:r>
-        <w:rPr>
-          <w:b/>
-        </w:rPr>
-        <w:t>Claude Code and OpenAI Codex</w:t>
-      </w:r>
-      <w:r>
-        <w:t xml:space="preserve"> rollout across a </w:t>
-      </w:r>
-      <w:r>
-        <w:rPr>
-          <w:b/>
-        </w:rPr>
-        <w:t>20-engineer</w:t>
-      </w:r>
-      <w:r>
-        <w:t xml:space="preserve"> team, covering daily design exploration, first-cut implementation and test scaffolding under review</w:t>
+        <w:t>, infrastructure cost down 25–30%</w:t>
       </w:r>
     </w:p>
     <w:p>
@@ -1496,7 +1163,58 @@
         <w:pStyle w:val="ListBullet"/>
       </w:pPr>
       <w:r>
-        <w:t xml:space="preserve">Implemented multi-tenant isolation across </w:t>
+        <w:t xml:space="preserve">Reframed axe Monitor's bottleneck as deployment, not product: </w:t>
+      </w:r>
+      <w:r>
+        <w:rPr>
+          <w:b/>
+        </w:rPr>
+        <w:t>280 clients</w:t>
+      </w:r>
+      <w:r>
+        <w:t>, each on its own instance, version and Keycloak, so every upgrade and trial multiplied</w:t>
+      </w:r>
+    </w:p>
+    <w:p>
+      <w:pPr>
+        <w:pStyle w:val="ListBullet"/>
+      </w:pPr>
+      <w:r>
+        <w:t xml:space="preserve">Implemented multi-tenancy as an organisation identifier on every table, resolving tenant from the JSON Web Token (JWT) into </w:t>
+      </w:r>
+      <w:r>
+        <w:rPr>
+          <w:b/>
+        </w:rPr>
+        <w:t>1 code path</w:t>
+      </w:r>
+      <w:r>
+        <w:t>, not database-per-customer</w:t>
+      </w:r>
+    </w:p>
+    <w:p>
+      <w:pPr>
+        <w:pStyle w:val="ListBullet"/>
+      </w:pPr>
+      <w:r>
+        <w:t xml:space="preserve">Steered 70–80% of customers onto shared axe Monitor instances on </w:t>
+      </w:r>
+      <w:r>
+        <w:rPr>
+          <w:b/>
+        </w:rPr>
+        <w:t>Spring Boot 2.x and Java 8/17</w:t>
+      </w:r>
+      <w:r>
+        <w:t>, one codebase also serving regulated banks on dedicated databases</w:t>
+      </w:r>
+    </w:p>
+    <w:p>
+      <w:pPr>
+        <w:pStyle w:val="ListBullet"/>
+      </w:pPr>
+      <w:r>
+        <w:t xml:space="preserve">Exposed shared platform application programming interfaces (APIs) to </w:t>
       </w:r>
       <w:r>
         <w:rPr>
@@ -1505,13 +1223,24 @@
         <w:t>280 axe Monitor clients</w:t>
       </w:r>
       <w:r>
-        <w:t xml:space="preserve">, adding an organisation identifier to every table and resolving tenant from the </w:t>
+        <w:t xml:space="preserve"> — Jira integration, API versioning, backward compatibility — on one Spring Boot backend</w:t>
+      </w:r>
+    </w:p>
+    <w:p>
+      <w:pPr>
+        <w:pStyle w:val="ListBullet"/>
+      </w:pPr>
+      <w:r>
+        <w:t xml:space="preserve">Championed decomposition of a monolith into </w:t>
       </w:r>
       <w:r>
         <w:rPr>
           <w:b/>
         </w:rPr>
-        <w:t>JSON Web Token (JWT)</w:t>
+        <w:t>10–15 services</w:t>
+      </w:r>
+      <w:r>
+        <w:t>, splitting only where a component needed independent scaling or its own multi-tenant database</w:t>
       </w:r>
     </w:p>
     <w:p>
@@ -1519,139 +1248,44 @@
         <w:pStyle w:val="ListBullet"/>
       </w:pPr>
       <w:r>
-        <w:t xml:space="preserve">Steered </w:t>
+        <w:t xml:space="preserve">Productized a billing and subscription service for </w:t>
       </w:r>
       <w:r>
         <w:rPr>
           <w:b/>
         </w:rPr>
-        <w:t>70–80%</w:t>
-      </w:r>
-      <w:r>
-        <w:t xml:space="preserve"> of customers onto shared </w:t>
+        <w:t>every Deque product</w:t>
+      </w:r>
+      <w:r>
+        <w:t>, restricting features by tier, porting it from Node.js/TypeScript to Java and Spring Boot</w:t>
+      </w:r>
+    </w:p>
+    <w:p>
+      <w:pPr>
+        <w:pStyle w:val="ListBullet"/>
+      </w:pPr>
+      <w:r>
+        <w:t xml:space="preserve">Forged central authentication in Java and Spring Boot on OAuth 2.0, folding every instance's local Keycloak into Red Hat single sign-on with </w:t>
       </w:r>
       <w:r>
         <w:rPr>
           <w:b/>
         </w:rPr>
-        <w:t>axe Monitor</w:t>
-      </w:r>
-      <w:r>
-        <w:t xml:space="preserve"> instances on </w:t>
+        <w:t>zero end-user disruption</w:t>
+      </w:r>
+    </w:p>
+    <w:p>
+      <w:pPr>
+        <w:pStyle w:val="ListBullet"/>
+      </w:pPr>
+      <w:r>
+        <w:t xml:space="preserve">Stewarded every axe Auditor instance from PostgreSQL 9.6 to Amazon Relational Database Service (RDS) PostgreSQL 13.x, then onto Aurora, with </w:t>
       </w:r>
       <w:r>
         <w:rPr>
           <w:b/>
         </w:rPr>
-        <w:t>Spring Boot 2.x and Java 8/17</w:t>
-      </w:r>
-      <w:r>
-        <w:t>, one codebase also serving regulated banks on dedicated databases</w:t>
-      </w:r>
-    </w:p>
-    <w:p>
-      <w:pPr>
-        <w:pStyle w:val="ListBullet"/>
-      </w:pPr>
-      <w:r>
-        <w:t xml:space="preserve">Forged central authentication in </w:t>
-      </w:r>
-      <w:r>
-        <w:rPr>
-          <w:b/>
-        </w:rPr>
-        <w:t>Java and Spring Boot</w:t>
-      </w:r>
-      <w:r>
-        <w:t xml:space="preserve">, migrating every instance from </w:t>
-      </w:r>
-      <w:r>
-        <w:rPr>
-          <w:b/>
-        </w:rPr>
-        <w:t>Keycloak</w:t>
-      </w:r>
-      <w:r>
-        <w:t xml:space="preserve"> to </w:t>
-      </w:r>
-      <w:r>
-        <w:rPr>
-          <w:b/>
-        </w:rPr>
-        <w:t>Red Hat single sign-on</w:t>
-      </w:r>
-      <w:r>
-        <w:t xml:space="preserve"> — users, roles, client registrations, groups, zero disruption</w:t>
-      </w:r>
-    </w:p>
-    <w:p>
-      <w:pPr>
-        <w:pStyle w:val="ListBullet"/>
-      </w:pPr>
-      <w:r>
-        <w:t xml:space="preserve">Productized a billing and subscription service consumed by </w:t>
-      </w:r>
-      <w:r>
-        <w:rPr>
-          <w:b/>
-        </w:rPr>
-        <w:t>every product</w:t>
-      </w:r>
-      <w:r>
-        <w:t xml:space="preserve">, porting it from </w:t>
-      </w:r>
-      <w:r>
-        <w:rPr>
-          <w:b/>
-        </w:rPr>
-        <w:t>Node.js/TypeScript</w:t>
-      </w:r>
-      <w:r>
-        <w:t xml:space="preserve"> to </w:t>
-      </w:r>
-      <w:r>
-        <w:rPr>
-          <w:b/>
-        </w:rPr>
-        <w:t>Java and Spring Boot</w:t>
-      </w:r>
-      <w:r>
-        <w:t xml:space="preserve"> and gating feature access by subscription</w:t>
-      </w:r>
-    </w:p>
-    <w:p>
-      <w:pPr>
-        <w:pStyle w:val="ListBullet"/>
-      </w:pPr>
-      <w:r>
-        <w:t xml:space="preserve">Stewarded a </w:t>
-      </w:r>
-      <w:r>
-        <w:rPr>
-          <w:b/>
-        </w:rPr>
-        <w:t>zero-downtime</w:t>
-      </w:r>
-      <w:r>
-        <w:t xml:space="preserve"> major-version upgrade from </w:t>
-      </w:r>
-      <w:r>
-        <w:rPr>
-          <w:b/>
-        </w:rPr>
-        <w:t>PostgreSQL 9.6</w:t>
-      </w:r>
-      <w:r>
-        <w:t xml:space="preserve"> to </w:t>
-      </w:r>
-      <w:r>
-        <w:rPr>
-          <w:b/>
-        </w:rPr>
-        <w:t>Amazon Aurora PostgreSQL 13.x</w:t>
-      </w:r>
-      <w:r>
-        <w:t xml:space="preserve"> across every axe Auditor instance</w:t>
+        <w:t>zero downtime</w:t>
       </w:r>
     </w:p>
     <w:p>
@@ -1668,31 +1302,7 @@
         <w:t>3–4 hours</w:t>
       </w:r>
       <w:r>
-        <w:t xml:space="preserve"> and deploy errors </w:t>
-      </w:r>
-      <w:r>
-        <w:rPr>
-          <w:b/>
-        </w:rPr>
-        <w:t>40%</w:t>
-      </w:r>
-      <w:r>
-        <w:t xml:space="preserve"> by moving </w:t>
-      </w:r>
-      <w:r>
-        <w:rPr>
-          <w:b/>
-        </w:rPr>
-        <w:t>PostgreSQL</w:t>
-      </w:r>
-      <w:r>
-        <w:t xml:space="preserve"> onto </w:t>
-      </w:r>
-      <w:r>
-        <w:rPr>
-          <w:b/>
-        </w:rPr>
-        <w:t>Amazon Relational Database Service (RDS)</w:t>
+        <w:t xml:space="preserve"> and deploy errors 40% by moving PostgreSQL onto Amazon RDS</w:t>
       </w:r>
     </w:p>
     <w:p>
@@ -1700,51 +1310,7 @@
         <w:pStyle w:val="ListBullet"/>
       </w:pPr>
       <w:r>
-        <w:t xml:space="preserve">Championed decomposition of a monolith into </w:t>
-      </w:r>
-      <w:r>
-        <w:rPr>
-          <w:b/>
-        </w:rPr>
-        <w:t>10–15 services</w:t>
-      </w:r>
-      <w:r>
-        <w:t>, splitting on independent scaling and database ownership rather than on team boundaries</w:t>
-      </w:r>
-    </w:p>
-    <w:p>
-      <w:pPr>
-        <w:pStyle w:val="ListBullet"/>
-      </w:pPr>
-      <w:r>
-        <w:t xml:space="preserve">Modernised continuous integration and continuous delivery (CI/CD) from </w:t>
-      </w:r>
-      <w:r>
-        <w:rPr>
-          <w:b/>
-        </w:rPr>
-        <w:t>Jenkins</w:t>
-      </w:r>
-      <w:r>
-        <w:t xml:space="preserve"> to </w:t>
-      </w:r>
-      <w:r>
-        <w:rPr>
-          <w:b/>
-        </w:rPr>
-        <w:t>GitHub Actions</w:t>
-      </w:r>
-      <w:r>
-        <w:t xml:space="preserve">, achieving </w:t>
-      </w:r>
-      <w:r>
-        <w:rPr>
-          <w:b/>
-        </w:rPr>
-        <w:t>ISO 27001</w:t>
-      </w:r>
-      <w:r>
-        <w:t xml:space="preserve"> and </w:t>
+        <w:t xml:space="preserve">Modernised continuous integration and continuous delivery (CI/CD) from Jenkins, whose jobs stalled at scale, to GitHub Actions, achieving ISO 27001 and </w:t>
       </w:r>
       <w:r>
         <w:rPr>
@@ -1770,13 +1336,21 @@
         <w:t>over 50%</w:t>
       </w:r>
       <w:r>
-        <w:t xml:space="preserve"> with an end-to-end automated testing framework built on </w:t>
+        <w:t xml:space="preserve"> with an end-to-end automated testing framework built on Puppeteer</w:t>
+      </w:r>
+    </w:p>
+    <w:p>
+      <w:pPr>
+        <w:pStyle w:val="ListBullet"/>
+      </w:pPr>
+      <w:r>
+        <w:t xml:space="preserve">Tackled accessibility teams' unknown page counts and unannounced changes to uniform resource locators (URLs) with spider discovery </w:t>
       </w:r>
       <w:r>
         <w:rPr>
           <w:b/>
         </w:rPr>
-        <w:t>Puppeteer</w:t>
+        <w:t>1 to 5 levels deep, or all</w:t>
       </w:r>
     </w:p>
     <w:p>
@@ -1784,16 +1358,16 @@
         <w:pStyle w:val="ListBullet"/>
       </w:pPr>
       <w:r>
-        <w:t xml:space="preserve">Orchestrated website discovery and accessibility scanning through spider jobs and </w:t>
+        <w:t xml:space="preserve">Orchestrated spider jobs and scheduled axe-core scans for </w:t>
       </w:r>
       <w:r>
         <w:rPr>
           <w:b/>
         </w:rPr>
-        <w:t>axe-core</w:t>
-      </w:r>
-      <w:r>
-        <w:t>, comparing every scheduled run to flag new, fixed and regressed uniform resource locators (URLs)</w:t>
+        <w:t>280 axe Monitor clients</w:t>
+      </w:r>
+      <w:r>
+        <w:t>, comparing each run with the last to flag new, fixed and regressed pages</w:t>
       </w:r>
     </w:p>
     <w:p>
@@ -1801,34 +1375,16 @@
         <w:pStyle w:val="ListBullet"/>
       </w:pPr>
       <w:r>
-        <w:t xml:space="preserve">Constructed run capture for the </w:t>
+        <w:t xml:space="preserve">Constructed comparable test runs in the axe DevTools browser extension, running axe-core on </w:t>
       </w:r>
       <w:r>
         <w:rPr>
           <w:b/>
         </w:rPr>
-        <w:t>axe DevTools browser extension</w:t>
-      </w:r>
-      <w:r>
-        <w:t xml:space="preserve">, detecting user actions across </w:t>
-      </w:r>
-      <w:r>
-        <w:rPr>
-          <w:b/>
-        </w:rPr>
-        <w:t>every page navigated</w:t>
-      </w:r>
-      <w:r>
-        <w:t xml:space="preserve">, running </w:t>
-      </w:r>
-      <w:r>
-        <w:rPr>
-          <w:b/>
-        </w:rPr>
-        <w:t>axe-core</w:t>
-      </w:r>
-      <w:r>
-        <w:t xml:space="preserve"> and de-duplicating issues server-side into comparable runs</w:t>
+        <w:t>every page and user action</w:t>
+      </w:r>
+      <w:r>
+        <w:t xml:space="preserve"> in a flow, de-duplicating issues server-side</w:t>
       </w:r>
     </w:p>
     <w:p>
@@ -1836,25 +1392,7 @@
         <w:pStyle w:val="ListBullet"/>
       </w:pPr>
       <w:r>
-        <w:t xml:space="preserve">Broadened </w:t>
-      </w:r>
-      <w:r>
-        <w:rPr>
-          <w:b/>
-        </w:rPr>
-        <w:t>axe DevTools</w:t>
-      </w:r>
-      <w:r>
-        <w:t xml:space="preserve"> scanning into </w:t>
-      </w:r>
-      <w:r>
-        <w:rPr>
-          <w:b/>
-        </w:rPr>
-        <w:t>cross-origin iframes</w:t>
-      </w:r>
-      <w:r>
-        <w:t xml:space="preserve">, a gap where the extension reported </w:t>
+        <w:t xml:space="preserve">Broadened axe DevTools scanning into cross-origin iframes, which the browser's security model hid and where the extension reported </w:t>
       </w:r>
       <w:r>
         <w:rPr>
@@ -1863,59 +1401,7 @@
         <w:t>zero issues</w:t>
       </w:r>
       <w:r>
-        <w:t xml:space="preserve">, landing </w:t>
-      </w:r>
-      <w:r>
-        <w:rPr>
-          <w:b/>
-        </w:rPr>
-        <w:t>phase one</w:t>
-      </w:r>
-      <w:r>
-        <w:t xml:space="preserve"> of that capability</w:t>
-      </w:r>
-    </w:p>
-    <w:p>
-      <w:pPr>
-        <w:pStyle w:val="ListBullet"/>
-      </w:pPr>
-      <w:r>
-        <w:t xml:space="preserve">Exposed shared platform application programming interfaces to </w:t>
-      </w:r>
-      <w:r>
-        <w:rPr>
-          <w:b/>
-        </w:rPr>
-        <w:t>280 axe Monitor clients</w:t>
-      </w:r>
-      <w:r>
-        <w:t xml:space="preserve"> — Jira integration, API versioning, customer-specific frontends on one </w:t>
-      </w:r>
-      <w:r>
-        <w:rPr>
-          <w:b/>
-        </w:rPr>
-        <w:t>Spring Boot</w:t>
-      </w:r>
-      <w:r>
-        <w:t xml:space="preserve"> backend, backward compatibility</w:t>
-      </w:r>
-    </w:p>
-    <w:p>
-      <w:pPr>
-        <w:pStyle w:val="ListBullet"/>
-      </w:pPr>
-      <w:r>
-        <w:t xml:space="preserve">Accelerated time-to-market </w:t>
-      </w:r>
-      <w:r>
-        <w:rPr>
-          <w:b/>
-        </w:rPr>
-        <w:t>2+ weeks per sprint</w:t>
-      </w:r>
-      <w:r>
-        <w:t>, leading multi-tenant SaaS delivery across engineering, quality assurance (QA) and support</w:t>
+        <w:t>, landing phase 1</w:t>
       </w:r>
     </w:p>
     <w:p>
@@ -1985,25 +1471,35 @@
         <w:t>IBM Db2 Configuration Manager</w:t>
       </w:r>
       <w:r>
-        <w:t xml:space="preserve"> monolith into </w:t>
+        <w:t xml:space="preserve"> monolith into Java and Spring Boot microservices, defining boundaries across z/OS mainframe and distributed platforms</w:t>
+      </w:r>
+    </w:p>
+    <w:p>
+      <w:pPr>
+        <w:pStyle w:val="ListBullet"/>
+      </w:pPr>
+      <w:r>
+        <w:t xml:space="preserve">Surfaced defect hot-spots by isolating services behind representational state transfer (REST) interfaces, reducing reported bugs </w:t>
       </w:r>
       <w:r>
         <w:rPr>
           <w:b/>
         </w:rPr>
-        <w:t>Java and Spring Boot</w:t>
-      </w:r>
-      <w:r>
-        <w:t xml:space="preserve"> microservices, defining boundaries across </w:t>
+        <w:t>over 50%</w:t>
+      </w:r>
+    </w:p>
+    <w:p>
+      <w:pPr>
+        <w:pStyle w:val="ListBullet"/>
+      </w:pPr>
+      <w:r>
+        <w:t xml:space="preserve">Partnered with product to extend platform support to Windows and three Linux distributions — Ubuntu, CentOS, Red Hat Enterprise Linux (RHEL) — raising sales </w:t>
       </w:r>
       <w:r>
         <w:rPr>
           <w:b/>
         </w:rPr>
-        <w:t>z/OS mainframe</w:t>
-      </w:r>
-      <w:r>
-        <w:t xml:space="preserve"> and distributed platforms</w:t>
+        <w:t>over 20%</w:t>
       </w:r>
     </w:p>
     <w:p>
@@ -2020,68 +1516,7 @@
         <w:t>5-engineer</w:t>
       </w:r>
       <w:r>
-        <w:t xml:space="preserve"> team through delivery planning, code review and performance appraisals, remaining hands-on as an individual-contributor </w:t>
-      </w:r>
-      <w:r>
-        <w:rPr>
-          <w:b/>
-        </w:rPr>
-        <w:t>Software Engineer III</w:t>
-      </w:r>
-    </w:p>
-    <w:p>
-      <w:pPr>
-        <w:pStyle w:val="ListBullet"/>
-      </w:pPr>
-      <w:r>
-        <w:t xml:space="preserve">Surfaced defect hot-spots by isolating services behind </w:t>
-      </w:r>
-      <w:r>
-        <w:rPr>
-          <w:b/>
-        </w:rPr>
-        <w:t>representational state transfer (REST)</w:t>
-      </w:r>
-      <w:r>
-        <w:t xml:space="preserve"> interfaces, reducing reported bugs </w:t>
-      </w:r>
-      <w:r>
-        <w:rPr>
-          <w:b/>
-        </w:rPr>
-        <w:t>over 50%</w:t>
-      </w:r>
-    </w:p>
-    <w:p>
-      <w:pPr>
-        <w:pStyle w:val="ListBullet"/>
-      </w:pPr>
-      <w:r>
-        <w:t xml:space="preserve">Partnered with product to extend platform support to </w:t>
-      </w:r>
-      <w:r>
-        <w:rPr>
-          <w:b/>
-        </w:rPr>
-        <w:t>Windows</w:t>
-      </w:r>
-      <w:r>
-        <w:t xml:space="preserve"> and three Linux distributions — Ubuntu, CentOS, </w:t>
-      </w:r>
-      <w:r>
-        <w:rPr>
-          <w:b/>
-        </w:rPr>
-        <w:t>Red Hat Enterprise Linux (RHEL)</w:t>
-      </w:r>
-      <w:r>
-        <w:t xml:space="preserve"> — raising sales </w:t>
-      </w:r>
-      <w:r>
-        <w:rPr>
-          <w:b/>
-        </w:rPr>
-        <w:t>over 20%</w:t>
+        <w:t xml:space="preserve"> team through delivery planning, code review and performance appraisals, remaining hands-on as an individual-contributor Software Engineer III</w:t>
       </w:r>
     </w:p>
     <w:p>
@@ -2142,16 +1577,7 @@
         <w:pStyle w:val="ListBullet"/>
       </w:pPr>
       <w:r>
-        <w:t xml:space="preserve">Co-founded VoltusWave and launched its first </w:t>
-      </w:r>
-      <w:r>
-        <w:rPr>
-          <w:b/>
-        </w:rPr>
-        <w:t>no-code application Platform-as-a-Service (aPaaS)</w:t>
-      </w:r>
-      <w:r>
-        <w:t xml:space="preserve"> for web and Android, winning </w:t>
+        <w:t xml:space="preserve">Co-founded VoltusWave and released its first no-code application Platform-as-a-Service (aPaaS) for web and Android on Amazon Elastic Container Service, winning </w:t>
       </w:r>
       <w:r>
         <w:rPr>
@@ -2174,42 +1600,7 @@
         <w:t>0 to 35</w:t>
       </w:r>
       <w:r>
-        <w:t xml:space="preserve"> in </w:t>
-      </w:r>
-      <w:r>
-        <w:rPr>
-          <w:b/>
-        </w:rPr>
-        <w:t>13 months</w:t>
-      </w:r>
-      <w:r>
-        <w:t>, mentoring freshers and senior engineers while establishing delivery process from scratch</w:t>
-      </w:r>
-    </w:p>
-    <w:p>
-      <w:pPr>
-        <w:pStyle w:val="ListBullet"/>
-      </w:pPr>
-      <w:r>
-        <w:t xml:space="preserve">Helmed end-to-end development, deployment and operations on </w:t>
-      </w:r>
-      <w:r>
-        <w:rPr>
-          <w:b/>
-        </w:rPr>
-        <w:t>Amazon Elastic Container Service</w:t>
-      </w:r>
-      <w:r>
-        <w:t xml:space="preserve">, setting the architectural roadmap </w:t>
-      </w:r>
-      <w:r>
-        <w:rPr>
-          <w:b/>
-        </w:rPr>
-        <w:t>every subsequent product</w:t>
-      </w:r>
-      <w:r>
-        <w:t xml:space="preserve"> worked from</w:t>
+        <w:t xml:space="preserve"> in 13 months, mentoring freshers and seniors and setting the architectural roadmap later products followed</w:t>
       </w:r>
     </w:p>
     <w:p>
@@ -2270,34 +1661,33 @@
         <w:pStyle w:val="ListBullet"/>
       </w:pPr>
       <w:r>
-        <w:t xml:space="preserve">Codified a parallel scatter-gather across </w:t>
+        <w:t xml:space="preserve">Codified a MuleSoft enterprise service bus scatter-gather giving sales reps </w:t>
       </w:r>
       <w:r>
         <w:rPr>
           <w:b/>
         </w:rPr>
-        <w:t>25 hotel suppliers</w:t>
-      </w:r>
-      <w:r>
-        <w:t xml:space="preserve"> on a </w:t>
+        <w:t>~30 suppliers' rates</w:t>
+      </w:r>
+      <w:r>
+        <w:t xml:space="preserve"> in parallel, superseding .NET 2.0 code a prior team could not upgrade</w:t>
+      </w:r>
+    </w:p>
+    <w:p>
+      <w:pPr>
+        <w:pStyle w:val="ListBullet"/>
+      </w:pPr>
+      <w:r>
+        <w:t xml:space="preserve">Retired a third-party hotel pricing search whose load-based billing grew with </w:t>
       </w:r>
       <w:r>
         <w:rPr>
           <w:b/>
         </w:rPr>
-        <w:t>MuleSoft enterprise service bus</w:t>
-      </w:r>
-      <w:r>
-        <w:t xml:space="preserve">, superseding a </w:t>
-      </w:r>
-      <w:r>
-        <w:rPr>
-          <w:b/>
-        </w:rPr>
-        <w:t>.NET 2.0</w:t>
-      </w:r>
-      <w:r>
-        <w:t xml:space="preserve"> stack a prior team could not upgrade</w:t>
+        <w:t>2–3 million daily requests</w:t>
+      </w:r>
+      <w:r>
+        <w:t xml:space="preserve"> at peak, calling suppliers directly instead</w:t>
       </w:r>
     </w:p>
     <w:p>
@@ -2305,7 +1695,7 @@
         <w:pStyle w:val="ListBullet"/>
       </w:pPr>
       <w:r>
-        <w:t xml:space="preserve">Lowered operational cost </w:t>
+        <w:t xml:space="preserve">Cached airport-destination-date queries on in-house Elasticsearch, Logstash and Kibana (ELK) with a 20-minute time-to-live, suppliers called only on a miss, lowering operational cost </w:t>
       </w:r>
       <w:r>
         <w:rPr>
@@ -2313,34 +1703,13 @@
         </w:rPr>
         <w:t>46%</w:t>
       </w:r>
-      <w:r>
-        <w:t xml:space="preserve"> by retiring a third-party pricing service billed on load, serving airport-destination-date queries from an in-house </w:t>
-      </w:r>
-      <w:r>
-        <w:rPr>
-          <w:b/>
-        </w:rPr>
-        <w:t>ELK</w:t>
-      </w:r>
-      <w:r>
-        <w:t xml:space="preserve"> cache with a </w:t>
-      </w:r>
-      <w:r>
-        <w:rPr>
-          <w:b/>
-        </w:rPr>
-        <w:t>20-minute</w:t>
-      </w:r>
-      <w:r>
-        <w:t xml:space="preserve"> time-to-live</w:t>
-      </w:r>
     </w:p>
     <w:p>
       <w:pPr>
         <w:pStyle w:val="ListBullet"/>
       </w:pPr>
       <w:r>
-        <w:t xml:space="preserve">Reconciled per-supplier hotel identifiers onto licensed </w:t>
+        <w:t xml:space="preserve">Traced hidden hotel inventory to clashing identifiers across ~30 suppliers, where unmapped properties lacked images and ratings, and adopted licensed </w:t>
       </w:r>
       <w:r>
         <w:rPr>
@@ -2348,17 +1717,13 @@
         </w:rPr>
         <w:t>GIATA MultiCodes</w:t>
       </w:r>
-      <w:r>
-        <w:t xml:space="preserve">, automating the pipeline on </w:t>
-      </w:r>
-      <w:r>
-        <w:rPr>
-          <w:b/>
-        </w:rPr>
-        <w:t>AWS Lambda</w:t>
-      </w:r>
-      <w:r>
-        <w:t xml:space="preserve"> with human approval retained, growing revenue </w:t>
+    </w:p>
+    <w:p>
+      <w:pPr>
+        <w:pStyle w:val="ListBullet"/>
+      </w:pPr>
+      <w:r>
+        <w:t xml:space="preserve">Mechanised the reconciliation pipeline on Amazon Web Services (AWS) Lambda with human approval retained, growing revenue </w:t>
       </w:r>
       <w:r>
         <w:rPr>
@@ -2381,16 +1746,7 @@
         <w:t>65%</w:t>
       </w:r>
       <w:r>
-        <w:t xml:space="preserve"> by widening matched inventory and ranking direct-contract properties first across </w:t>
-      </w:r>
-      <w:r>
-        <w:rPr>
-          <w:b/>
-        </w:rPr>
-        <w:t>2–3 million daily requests</w:t>
-      </w:r>
-      <w:r>
-        <w:t xml:space="preserve"> at peak</w:t>
+        <w:t xml:space="preserve"> by widening matched inventory, so each hotel's lowest supplier rate could be shown, at 2–3 million daily requests</w:t>
       </w:r>
     </w:p>
     <w:p>
@@ -2451,16 +1807,41 @@
         <w:pStyle w:val="ListBullet"/>
       </w:pPr>
       <w:r>
-        <w:t xml:space="preserve">Eliminated the </w:t>
+        <w:t xml:space="preserve">Pinpointed </w:t>
       </w:r>
       <w:r>
         <w:rPr>
           <w:b/>
         </w:rPr>
-        <w:t>Windows Server and SQL Server licence</w:t>
-      </w:r>
-      <w:r>
-        <w:t xml:space="preserve"> bill that was customers' biggest cost objection, unlocking </w:t>
+        <w:t>2 paid Microsoft licences</w:t>
+      </w:r>
+      <w:r>
+        <w:t>, Windows Server and SQL Server, as the biggest customer cost objection to a Governance, Risk and Compliance (GRC) platform</w:t>
+      </w:r>
+    </w:p>
+    <w:p>
+      <w:pPr>
+        <w:pStyle w:val="ListBullet"/>
+      </w:pPr>
+      <w:r>
+        <w:t xml:space="preserve">Recast the SQL Server data model as MySQL on Ubuntu and Node.js, a </w:t>
+      </w:r>
+      <w:r>
+        <w:rPr>
+          <w:b/>
+        </w:rPr>
+        <w:t>2nd supported stack</w:t>
+      </w:r>
+      <w:r>
+        <w:t xml:space="preserve"> for new enterprise accounts only, leaving Windows customers untouched</w:t>
+      </w:r>
+    </w:p>
+    <w:p>
+      <w:pPr>
+        <w:pStyle w:val="ListBullet"/>
+      </w:pPr>
+      <w:r>
+        <w:t xml:space="preserve">Unlocked </w:t>
       </w:r>
       <w:r>
         <w:rPr>
@@ -2469,74 +1850,7 @@
         <w:t>12 new enterprise customers</w:t>
       </w:r>
       <w:r>
-        <w:t xml:space="preserve"> in two months</w:t>
-      </w:r>
-    </w:p>
-    <w:p>
-      <w:pPr>
-        <w:pStyle w:val="ListBullet"/>
-      </w:pPr>
-      <w:r>
-        <w:t xml:space="preserve">Recast the </w:t>
-      </w:r>
-      <w:r>
-        <w:rPr>
-          <w:b/>
-        </w:rPr>
-        <w:t>Microsoft SQL Server</w:t>
-      </w:r>
-      <w:r>
-        <w:t xml:space="preserve"> data model as a </w:t>
-      </w:r>
-      <w:r>
-        <w:rPr>
-          <w:b/>
-        </w:rPr>
-        <w:t>MySQL</w:t>
-      </w:r>
-      <w:r>
-        <w:t xml:space="preserve"> schema, packaging the product for </w:t>
-      </w:r>
-      <w:r>
-        <w:rPr>
-          <w:b/>
-        </w:rPr>
-        <w:t>Ubuntu and Node.js</w:t>
-      </w:r>
-      <w:r>
-        <w:t xml:space="preserve"> and retiring </w:t>
-      </w:r>
-      <w:r>
-        <w:rPr>
-          <w:b/>
-        </w:rPr>
-        <w:t>2 paid Microsoft licences</w:t>
-      </w:r>
-    </w:p>
-    <w:p>
-      <w:pPr>
-        <w:pStyle w:val="ListBullet"/>
-      </w:pPr>
-      <w:r>
-        <w:t xml:space="preserve">Segmented the deployment model into </w:t>
-      </w:r>
-      <w:r>
-        <w:rPr>
-          <w:b/>
-        </w:rPr>
-        <w:t>2 supported stacks</w:t>
-      </w:r>
-      <w:r>
-        <w:t xml:space="preserve">, offering the licence-free Linux option to new enterprise accounts only so existing </w:t>
-      </w:r>
-      <w:r>
-        <w:rPr>
-          <w:b/>
-        </w:rPr>
-        <w:t>Windows Server</w:t>
-      </w:r>
-      <w:r>
-        <w:t xml:space="preserve"> customers stayed untouched</w:t>
+        <w:t xml:space="preserve"> in two months, October and November 2015, on the licence-free Linux deployment</w:t>
       </w:r>
     </w:p>
     <w:p>
@@ -2597,34 +1911,38 @@
         <w:pStyle w:val="ListBullet"/>
       </w:pPr>
       <w:r>
-        <w:t xml:space="preserve">Replatformed a server-rendered </w:t>
+        <w:t xml:space="preserve">Replatformed a server-rendered ASP.NET application into an AngularJS single-page application (SPA) over .NET Windows Communication Foundation (WCF) services, </w:t>
       </w:r>
       <w:r>
         <w:rPr>
           <w:b/>
         </w:rPr>
-        <w:t>ASP.NET</w:t>
-      </w:r>
-      <w:r>
-        <w:t xml:space="preserve"> application into a </w:t>
+        <w:t>splitting 1 app into 2 tiers</w:t>
+      </w:r>
+    </w:p>
+    <w:p>
+      <w:pPr>
+        <w:pStyle w:val="ListBullet"/>
+      </w:pPr>
+      <w:r>
+        <w:t xml:space="preserve">Calibrated the data layer on </w:t>
       </w:r>
       <w:r>
         <w:rPr>
           <w:b/>
         </w:rPr>
-        <w:t>single-page application (SPA)</w:t>
-      </w:r>
-      <w:r>
-        <w:t xml:space="preserve"> on </w:t>
-      </w:r>
-      <w:r>
-        <w:rPr>
-          <w:b/>
-        </w:rPr>
-        <w:t>AngularJS</w:t>
-      </w:r>
-      <w:r>
-        <w:t xml:space="preserve">, for a </w:t>
+        <w:t>3 fronts</w:t>
+      </w:r>
+      <w:r>
+        <w:t>, stored procedures, table design and indexing, clearing the query bottlenecks behind slow screen loads</w:t>
+      </w:r>
+    </w:p>
+    <w:p>
+      <w:pPr>
+        <w:pStyle w:val="ListBullet"/>
+      </w:pPr>
+      <w:r>
+        <w:t xml:space="preserve">Shortened screen load times </w:t>
       </w:r>
       <w:r>
         <w:rPr>
@@ -2633,68 +1951,7 @@
         <w:t>60–70%</w:t>
       </w:r>
       <w:r>
-        <w:t xml:space="preserve"> drop in screen load time</w:t>
-      </w:r>
-    </w:p>
-    <w:p>
-      <w:pPr>
-        <w:pStyle w:val="ListBullet"/>
-      </w:pPr>
-      <w:r>
-        <w:t xml:space="preserve">Calibrated the data layer on </w:t>
-      </w:r>
-      <w:r>
-        <w:rPr>
-          <w:b/>
-        </w:rPr>
-        <w:t>3 fronts</w:t>
-      </w:r>
-      <w:r>
-        <w:t xml:space="preserve"> — </w:t>
-      </w:r>
-      <w:r>
-        <w:rPr>
-          <w:b/>
-        </w:rPr>
-        <w:t>stored procedures</w:t>
-      </w:r>
-      <w:r>
-        <w:t>, table design and indexing — clearing the query bottlenecks behind slow screen loads</w:t>
-      </w:r>
-    </w:p>
-    <w:p>
-      <w:pPr>
-        <w:pStyle w:val="ListBullet"/>
-      </w:pPr>
-      <w:r>
-        <w:t xml:space="preserve">Underpinned the </w:t>
-      </w:r>
-      <w:r>
-        <w:rPr>
-          <w:b/>
-        </w:rPr>
-        <w:t>AngularJS</w:t>
-      </w:r>
-      <w:r>
-        <w:t xml:space="preserve"> client with </w:t>
-      </w:r>
-      <w:r>
-        <w:rPr>
-          <w:b/>
-        </w:rPr>
-        <w:t>.NET Windows Communication Foundation (WCF)</w:t>
-      </w:r>
-      <w:r>
-        <w:t xml:space="preserve"> services, splitting one web application into </w:t>
-      </w:r>
-      <w:r>
-        <w:rPr>
-          <w:b/>
-        </w:rPr>
-        <w:t>2 tiers</w:t>
-      </w:r>
-      <w:r>
-        <w:t xml:space="preserve"> the browser could call directly</w:t>
+        <w:t xml:space="preserve"> once the single-page client and tuned queries replaced server-rendered pages</w:t>
       </w:r>
     </w:p>
     <w:p>
@@ -2755,83 +2012,33 @@
         <w:pStyle w:val="ListBullet"/>
       </w:pPr>
       <w:r>
-        <w:t xml:space="preserve">Piloted </w:t>
+        <w:t xml:space="preserve">Unified employee records from every store for leadership in a </w:t>
       </w:r>
       <w:r>
         <w:rPr>
           <w:b/>
         </w:rPr>
-        <w:t>Master Data Management (MDM)</w:t>
-      </w:r>
-      <w:r>
-        <w:t xml:space="preserve"> across </w:t>
+        <w:t>2-country</w:t>
+      </w:r>
+      <w:r>
+        <w:t xml:space="preserve"> Master Data Management (MDM) pilot, United States and Canada, on SQL Server</w:t>
+      </w:r>
+    </w:p>
+    <w:p>
+      <w:pPr>
+        <w:pStyle w:val="ListBullet"/>
+      </w:pPr>
+      <w:r>
+        <w:t xml:space="preserve">Salvaged the unusable built-in MDM interface with a rebuilt front end, adding </w:t>
       </w:r>
       <w:r>
         <w:rPr>
           <w:b/>
         </w:rPr>
-        <w:t>2 countries</w:t>
-      </w:r>
-      <w:r>
-        <w:t xml:space="preserve"> — United States and Canada — consolidating employee records from </w:t>
-      </w:r>
-      <w:r>
-        <w:rPr>
-          <w:b/>
-        </w:rPr>
-        <w:t>every store</w:t>
-      </w:r>
-      <w:r>
-        <w:t xml:space="preserve"> onto </w:t>
-      </w:r>
-      <w:r>
-        <w:rPr>
-          <w:b/>
-        </w:rPr>
-        <w:t>SQL Server</w:t>
-      </w:r>
-    </w:p>
-    <w:p>
-      <w:pPr>
-        <w:pStyle w:val="ListBullet"/>
-      </w:pPr>
-      <w:r>
-        <w:t xml:space="preserve">Curated field-level metadata on </w:t>
-      </w:r>
-      <w:r>
-        <w:rPr>
-          <w:b/>
-        </w:rPr>
-        <w:t>every master record</w:t>
-      </w:r>
-      <w:r>
-        <w:t xml:space="preserve"> — first seen and last updated per attribute — giving leadership field history the built-in tool never showed</w:t>
-      </w:r>
-    </w:p>
-    <w:p>
-      <w:pPr>
-        <w:pStyle w:val="ListBullet"/>
-      </w:pPr>
-      <w:r>
-        <w:t xml:space="preserve">Salvaged an unusable built-in </w:t>
-      </w:r>
-      <w:r>
-        <w:rPr>
-          <w:b/>
-        </w:rPr>
-        <w:t>MDM</w:t>
-      </w:r>
-      <w:r>
-        <w:t xml:space="preserve"> interface, rebuilding the front end that handed leadership its </w:t>
-      </w:r>
-      <w:r>
-        <w:rPr>
-          <w:b/>
-        </w:rPr>
-        <w:t>single unified view</w:t>
-      </w:r>
-      <w:r>
-        <w:t xml:space="preserve"> of employee data</w:t>
+        <w:t>first seen and last updated</w:t>
+      </w:r>
+      <w:r>
+        <w:t xml:space="preserve"> timestamps per field on every master record</w:t>
       </w:r>
     </w:p>
     <w:p>
@@ -2892,34 +2099,7 @@
         <w:pStyle w:val="ListBullet"/>
       </w:pPr>
       <w:r>
-        <w:t xml:space="preserve">Translated a Citrix-hosted </w:t>
-      </w:r>
-      <w:r>
-        <w:rPr>
-          <w:b/>
-        </w:rPr>
-        <w:t>Java</w:t>
-      </w:r>
-      <w:r>
-        <w:t xml:space="preserve"> application into </w:t>
-      </w:r>
-      <w:r>
-        <w:rPr>
-          <w:b/>
-        </w:rPr>
-        <w:t>JavaServer Pages (JSP)</w:t>
-      </w:r>
-      <w:r>
-        <w:t xml:space="preserve"> and </w:t>
-      </w:r>
-      <w:r>
-        <w:rPr>
-          <w:b/>
-        </w:rPr>
-        <w:t>Java Enterprise Edition</w:t>
-      </w:r>
-      <w:r>
-        <w:t xml:space="preserve"> for Tennessee Gas Pipeline, an </w:t>
+        <w:t xml:space="preserve">Translated a Citrix-hosted Java application into JavaServer Pages (JSP) and Java Enterprise Edition for Tennessee Gas Pipeline, an </w:t>
       </w:r>
       <w:r>
         <w:rPr>
@@ -2936,7 +2116,7 @@
         <w:pStyle w:val="ListBullet"/>
       </w:pPr>
       <w:r>
-        <w:t xml:space="preserve">Built </w:t>
+        <w:t xml:space="preserve">Evolved </w:t>
       </w:r>
       <w:r>
         <w:rPr>
@@ -2945,22 +2125,7 @@
         <w:t>3 core modules</w:t>
       </w:r>
       <w:r>
-        <w:t xml:space="preserve"> — </w:t>
-      </w:r>
-      <w:r>
-        <w:rPr>
-          <w:b/>
-        </w:rPr>
-        <w:t>Nominations, Flowing Gas and Contracts</w:t>
-      </w:r>
-      <w:r>
-        <w:t xml:space="preserve"> — covering scheduling and contracting for interstate gas transport over </w:t>
-      </w:r>
-      <w:r>
-        <w:rPr>
-          <w:b/>
-        </w:rPr>
-        <w:t>4 years</w:t>
+        <w:t xml:space="preserve"> — Nominations, Flowing Gas and Contracts — as requirements arrived, covering scheduling and contracting for interstate gas transport over 4 years</w:t>
       </w:r>
     </w:p>
     <w:p>
@@ -2968,7 +2133,7 @@
         <w:pStyle w:val="ListBullet"/>
       </w:pPr>
       <w:r>
-        <w:t xml:space="preserve">Refactored the data layer through a </w:t>
+        <w:t xml:space="preserve">Refactored the scheduling modules' schema and stored procedures through a </w:t>
       </w:r>
       <w:r>
         <w:rPr>
@@ -2977,30 +2142,7 @@
         <w:t>SQL Server 2000 to 2005</w:t>
       </w:r>
       <w:r>
-        <w:t xml:space="preserve"> migration, carrying the scheduling modules' schema and queries onto the newer engine</w:t>
-      </w:r>
-    </w:p>
-    <w:p>
-      <w:pPr>
-        <w:pStyle w:val="ListBullet"/>
-      </w:pPr>
-      <w:r>
-        <w:t xml:space="preserve">Sharpened the query layer behind interstate gas scheduling — authoring and optimising </w:t>
-      </w:r>
-      <w:r>
-        <w:rPr>
-          <w:b/>
-        </w:rPr>
-        <w:t>stored procedures</w:t>
-      </w:r>
-      <w:r>
-        <w:t xml:space="preserve">, owning table and index design — on </w:t>
-      </w:r>
-      <w:r>
-        <w:rPr>
-          <w:b/>
-        </w:rPr>
-        <w:t>SQL Server 2005</w:t>
+        <w:t xml:space="preserve"> migration, owning table and index design and query tuning</w:t>
       </w:r>
     </w:p>
     <w:p>
@@ -3061,25 +2203,7 @@
         <w:pStyle w:val="ListBullet"/>
       </w:pPr>
       <w:r>
-        <w:t xml:space="preserve">Bridged suppliers and buyers through a </w:t>
-      </w:r>
-      <w:r>
-        <w:rPr>
-          <w:b/>
-        </w:rPr>
-        <w:t>.NET</w:t>
-      </w:r>
-      <w:r>
-        <w:t xml:space="preserve"> portal on </w:t>
-      </w:r>
-      <w:r>
-        <w:rPr>
-          <w:b/>
-        </w:rPr>
-        <w:t>SQL Server 2005</w:t>
-      </w:r>
-      <w:r>
-        <w:t xml:space="preserve">, integrating </w:t>
+        <w:t xml:space="preserve">Bridged suppliers and buyers through a .NET portal on SQL Server 2005, integrating </w:t>
       </w:r>
       <w:r>
         <w:rPr>
@@ -3096,16 +2220,7 @@
         <w:pStyle w:val="ListBullet"/>
       </w:pPr>
       <w:r>
-        <w:t xml:space="preserve">Seeded portal adoption with a </w:t>
-      </w:r>
-      <w:r>
-        <w:rPr>
-          <w:b/>
-        </w:rPr>
-        <w:t>Windows service</w:t>
-      </w:r>
-      <w:r>
-        <w:t xml:space="preserve"> that swept </w:t>
+        <w:t xml:space="preserve">Seeded portal adoption with a Windows service sweeping </w:t>
       </w:r>
       <w:r>
         <w:rPr>
@@ -3114,13 +2229,7 @@
         <w:t>every invoice</w:t>
       </w:r>
       <w:r>
-        <w:t xml:space="preserve"> from a watched folder onto the server, moving the business off </w:t>
-      </w:r>
-      <w:r>
-        <w:rPr>
-          <w:b/>
-        </w:rPr>
-        <w:t>manual submission</w:t>
+        <w:t xml:space="preserve"> from a watched folder to the server, built to move everyone onto the portal</w:t>
       </w:r>
     </w:p>
     <w:p>

</xml_diff>

<commit_message>
RESUME_SESSION.md: server restarted on 8006 (new PID)
Co-Authored-By: Claude Opus 5.5 <noreply@anthropic.com>
</commit_message>
<xml_diff>
--- a/master/Abhisheik_Deo_Resume.docx
+++ b/master/Abhisheik_Deo_Resume.docx
@@ -36,7 +36,28 @@
           <w:color w:val="328EF7"/>
           <w:sz w:val="18"/>
         </w:rPr>
-        <w:t xml:space="preserve"> · +91 93640 27487</w:t>
+        <w:t xml:space="preserve"> · </w:t>
+      </w:r>
+      <w:r>
+        <w:rPr>
+          <w:color w:val="328EF7"/>
+          <w:sz w:val="18"/>
+        </w:rPr>
+        <w:t>+91 96340 27487</w:t>
+      </w:r>
+      <w:r>
+        <w:rPr>
+          <w:color w:val="328EF7"/>
+          <w:sz w:val="18"/>
+        </w:rPr>
+        <w:t xml:space="preserve"> </w:t>
+      </w:r>
+      <w:r>
+        <w:rPr>
+          <w:color w:val="328EF7"/>
+          <w:sz w:val="18"/>
+        </w:rPr>
+        <w:t>/ +91 97049 68861</w:t>
       </w:r>
       <w:hyperlink r:id="rId6">
         <w:r>

</xml_diff>